<commit_message>
Update app.py and sa.py with new features and bug fixes
</commit_message>
<xml_diff>
--- a/Word/app.docx
+++ b/Word/app.docx
@@ -6084,20 +6084,32 @@
         <w:t xml:space="preserve">                max_date = valid_dates.max().date() if not valid_dates.empty else datetime.now().date()</w:t>
       </w:r>
     </w:p>
-    <w:p>
-      <w:r>
-        <w:t xml:space="preserve">                start_date, end_date = st.date_input(</w:t>
-      </w:r>
-    </w:p>
+    <w:p/>
     <w:p>
       <w:r>
         <w:lastRenderedPageBreak/>
-        <w:t xml:space="preserve">                    "Measured Date Range",</w:t>
-      </w:r>
-    </w:p>
-    <w:p>
-      <w:r>
-        <w:t xml:space="preserve">                    value=(min_date, max_date)</w:t>
+        <w:t xml:space="preserve">                # Ensure the value is always a tuple for Streamlit</w:t>
+      </w:r>
+    </w:p>
+    <w:p>
+      <w:r>
+        <w:t xml:space="preserve">                date_input_val = (min_date, max_date) if min_date != max_date else min_date</w:t>
+      </w:r>
+    </w:p>
+    <w:p/>
+    <w:p>
+      <w:r>
+        <w:t xml:space="preserve">                selected_dates = st.date_input(</w:t>
+      </w:r>
+    </w:p>
+    <w:p>
+      <w:r>
+        <w:t xml:space="preserve">                    "Measured Date Range (Please select at least 2 dates. If you only want to view a single date, you need to click the filter date button twice)",</w:t>
+      </w:r>
+    </w:p>
+    <w:p>
+      <w:r>
+        <w:t xml:space="preserve">                    value=date_input_val</w:t>
       </w:r>
     </w:p>
     <w:p>
@@ -6105,6 +6117,33 @@
         <w:t xml:space="preserve">                )</w:t>
       </w:r>
     </w:p>
+    <w:p/>
+    <w:p>
+      <w:r>
+        <w:t xml:space="preserve">                # Ensure selected_dates is always a tuple (start, end)</w:t>
+      </w:r>
+    </w:p>
+    <w:p>
+      <w:r>
+        <w:t xml:space="preserve">                if isinstance(selected_dates, tuple) or isinstance(selected_dates, list):</w:t>
+      </w:r>
+    </w:p>
+    <w:p>
+      <w:r>
+        <w:t xml:space="preserve">                    start_date, end_date = selected_dates</w:t>
+      </w:r>
+    </w:p>
+    <w:p>
+      <w:r>
+        <w:t xml:space="preserve">                else:</w:t>
+      </w:r>
+    </w:p>
+    <w:p>
+      <w:r>
+        <w:t xml:space="preserve">                    start_date = end_date = selected_dates</w:t>
+      </w:r>
+    </w:p>
+    <w:p/>
     <w:p>
       <w:r>
         <w:t xml:space="preserve">                df_view = df_view[</w:t>
@@ -6128,9 +6167,10 @@
     <w:p/>
     <w:p>
       <w:r>
-        <w:t xml:space="preserve">        st.success(f"Filtered results: **{len(df_view)} rows**")</w:t>
-      </w:r>
-    </w:p>
+        <w:t xml:space="preserve">            st.success(f"Filtered results: **{len(df_view)} rows**")</w:t>
+      </w:r>
+    </w:p>
+    <w:p/>
     <w:p/>
     <w:p>
       <w:r>
@@ -6206,13 +6246,113 @@
     </w:p>
     <w:p>
       <w:r>
+        <w:t xml:space="preserve">                font-family: Arial, sans-serif;</w:t>
+      </w:r>
+    </w:p>
+    <w:p>
+      <w:r>
+        <w:t xml:space="preserve">                font-size: 14px;</w:t>
+      </w:r>
+    </w:p>
+    <w:p>
+      <w:r>
+        <w:t xml:space="preserve">            }</w:t>
+      </w:r>
+    </w:p>
+    <w:p>
+      <w:r>
+        <w:t xml:space="preserve">            table.custom-table th, table.custom-table td {</w:t>
+      </w:r>
+    </w:p>
+    <w:p>
+      <w:r>
+        <w:t xml:space="preserve">                border: 1px solid #ccc;</w:t>
+      </w:r>
+    </w:p>
+    <w:p>
+      <w:r>
+        <w:t xml:space="preserve">                padding: 6px 8px;</w:t>
+      </w:r>
+    </w:p>
+    <w:p>
+      <w:r>
+        <w:t xml:space="preserve">                text-align: center;</w:t>
+      </w:r>
+    </w:p>
+    <w:p>
+      <w:r>
+        <w:t xml:space="preserve">            }</w:t>
+      </w:r>
+    </w:p>
+    <w:p>
+      <w:r>
+        <w:t xml:space="preserve">            table.custom-table th {</w:t>
+      </w:r>
+    </w:p>
+    <w:p>
+      <w:r>
+        <w:t xml:space="preserve">                background-color: #2c3e50;</w:t>
+      </w:r>
+    </w:p>
+    <w:p>
+      <w:r>
+        <w:t xml:space="preserve">                color: white;</w:t>
+      </w:r>
+    </w:p>
+    <w:p>
+      <w:r>
+        <w:t xml:space="preserve">                font-weight: bold;</w:t>
+      </w:r>
+    </w:p>
+    <w:p>
+      <w:r>
+        <w:t xml:space="preserve">            }</w:t>
+      </w:r>
+    </w:p>
+    <w:p>
+      <w:r>
         <w:lastRenderedPageBreak/>
-        <w:t xml:space="preserve">                font-family: Arial, sans-serif;</w:t>
-      </w:r>
-    </w:p>
-    <w:p>
-      <w:r>
-        <w:t xml:space="preserve">                font-size: 14px;</w:t>
+        <w:t xml:space="preserve">            .pass { background-color: #27ae60 !important; color: white !important; font-weight: bold; }</w:t>
+      </w:r>
+    </w:p>
+    <w:p>
+      <w:r>
+        <w:t xml:space="preserve">            .fail { background-color: #e74c3c !important; color: white !important; font-weight: bold; }</w:t>
+      </w:r>
+    </w:p>
+    <w:p>
+      <w:r>
+        <w:t xml:space="preserve">            tr.separator td { border-top: 4px solid black !important; }</w:t>
+      </w:r>
+    </w:p>
+    <w:p>
+      <w:r>
+        <w:t xml:space="preserve">            .image-cell img {</w:t>
+      </w:r>
+    </w:p>
+    <w:p>
+      <w:r>
+        <w:t xml:space="preserve">                max-width: 100px;</w:t>
+      </w:r>
+    </w:p>
+    <w:p>
+      <w:r>
+        <w:t xml:space="preserve">                max-height: 100px;</w:t>
+      </w:r>
+    </w:p>
+    <w:p>
+      <w:r>
+        <w:t xml:space="preserve">                display: block;</w:t>
+      </w:r>
+    </w:p>
+    <w:p>
+      <w:r>
+        <w:t xml:space="preserve">                margin: auto;</w:t>
+      </w:r>
+    </w:p>
+    <w:p>
+      <w:r>
+        <w:t xml:space="preserve">                cursor: pointer;</w:t>
       </w:r>
     </w:p>
     <w:p>
@@ -6222,106 +6362,6 @@
     </w:p>
     <w:p>
       <w:r>
-        <w:t xml:space="preserve">            table.custom-table th, table.custom-table td {</w:t>
-      </w:r>
-    </w:p>
-    <w:p>
-      <w:r>
-        <w:t xml:space="preserve">                border: 1px solid #ccc;</w:t>
-      </w:r>
-    </w:p>
-    <w:p>
-      <w:r>
-        <w:t xml:space="preserve">                padding: 6px 8px;</w:t>
-      </w:r>
-    </w:p>
-    <w:p>
-      <w:r>
-        <w:t xml:space="preserve">                text-align: center;</w:t>
-      </w:r>
-    </w:p>
-    <w:p>
-      <w:r>
-        <w:t xml:space="preserve">            }</w:t>
-      </w:r>
-    </w:p>
-    <w:p>
-      <w:r>
-        <w:t xml:space="preserve">            table.custom-table th {</w:t>
-      </w:r>
-    </w:p>
-    <w:p>
-      <w:r>
-        <w:t xml:space="preserve">                background-color: #2c3e50;</w:t>
-      </w:r>
-    </w:p>
-    <w:p>
-      <w:r>
-        <w:t xml:space="preserve">                color: white;</w:t>
-      </w:r>
-    </w:p>
-    <w:p>
-      <w:r>
-        <w:t xml:space="preserve">                font-weight: bold;</w:t>
-      </w:r>
-    </w:p>
-    <w:p>
-      <w:r>
-        <w:t xml:space="preserve">            }</w:t>
-      </w:r>
-    </w:p>
-    <w:p>
-      <w:r>
-        <w:t xml:space="preserve">            .pass { background-color: #27ae60 !important; color: white !important; font-weight: bold; }</w:t>
-      </w:r>
-    </w:p>
-    <w:p>
-      <w:r>
-        <w:t xml:space="preserve">            .fail { background-color: #e74c3c !important; color: white !important; font-weight: bold; }</w:t>
-      </w:r>
-    </w:p>
-    <w:p>
-      <w:r>
-        <w:t xml:space="preserve">            tr.separator td { border-top: 4px solid black !important; }</w:t>
-      </w:r>
-    </w:p>
-    <w:p>
-      <w:r>
-        <w:t xml:space="preserve">            .image-cell img {</w:t>
-      </w:r>
-    </w:p>
-    <w:p>
-      <w:r>
-        <w:t xml:space="preserve">                max-width: 100px;</w:t>
-      </w:r>
-    </w:p>
-    <w:p>
-      <w:r>
-        <w:t xml:space="preserve">                max-height: 100px;</w:t>
-      </w:r>
-    </w:p>
-    <w:p>
-      <w:r>
-        <w:t xml:space="preserve">                display: block;</w:t>
-      </w:r>
-    </w:p>
-    <w:p>
-      <w:r>
-        <w:t xml:space="preserve">                margin: auto;</w:t>
-      </w:r>
-    </w:p>
-    <w:p>
-      <w:r>
-        <w:t xml:space="preserve">                cursor: pointer;</w:t>
-      </w:r>
-    </w:p>
-    <w:p>
-      <w:r>
-        <w:t xml:space="preserve">            }</w:t>
-      </w:r>
-    </w:p>
-    <w:p>
-      <w:r>
         <w:t xml:space="preserve">            .value-cell { background-color: #f9f9d9; }</w:t>
       </w:r>
     </w:p>
@@ -6332,55 +6372,55 @@
     </w:p>
     <w:p>
       <w:r>
+        <w:t xml:space="preserve">            .usl-cell { background-color: #e8f8e8; }</w:t>
+      </w:r>
+    </w:p>
+    <w:p>
+      <w:r>
+        <w:t xml:space="preserve">        &lt;/style&gt;</w:t>
+      </w:r>
+    </w:p>
+    <w:p>
+      <w:r>
+        <w:t xml:space="preserve">        &lt;table class="custom-table"&gt;</w:t>
+      </w:r>
+    </w:p>
+    <w:p>
+      <w:r>
+        <w:t xml:space="preserve">            &lt;thead&gt;&lt;tr&gt;</w:t>
+      </w:r>
+    </w:p>
+    <w:p>
+      <w:r>
+        <w:t xml:space="preserve">        """</w:t>
+      </w:r>
+    </w:p>
+    <w:p/>
+    <w:p>
+      <w:r>
+        <w:t xml:space="preserve">        html += "&lt;th&gt;Row&lt;/th&gt;" + "".join(f"&lt;th&gt;{col}&lt;/th&gt;" for col in df_display.columns) + "&lt;/tr&gt;&lt;/thead&gt;&lt;tbody&gt;"</w:t>
+      </w:r>
+    </w:p>
+    <w:p/>
+    <w:p>
+      <w:r>
+        <w:t xml:space="preserve">        for i in range(len(df_display)):</w:t>
+      </w:r>
+    </w:p>
+    <w:p>
+      <w:r>
+        <w:t xml:space="preserve">            row = df_display.iloc[i]</w:t>
+      </w:r>
+    </w:p>
+    <w:p>
+      <w:r>
+        <w:t xml:space="preserve">            row_class = ""</w:t>
+      </w:r>
+    </w:p>
+    <w:p/>
+    <w:p>
+      <w:r>
         <w:lastRenderedPageBreak/>
-        <w:t xml:space="preserve">            .usl-cell { background-color: #e8f8e8; }</w:t>
-      </w:r>
-    </w:p>
-    <w:p>
-      <w:r>
-        <w:t xml:space="preserve">        &lt;/style&gt;</w:t>
-      </w:r>
-    </w:p>
-    <w:p>
-      <w:r>
-        <w:t xml:space="preserve">        &lt;table class="custom-table"&gt;</w:t>
-      </w:r>
-    </w:p>
-    <w:p>
-      <w:r>
-        <w:t xml:space="preserve">            &lt;thead&gt;&lt;tr&gt;</w:t>
-      </w:r>
-    </w:p>
-    <w:p>
-      <w:r>
-        <w:t xml:space="preserve">        """</w:t>
-      </w:r>
-    </w:p>
-    <w:p/>
-    <w:p>
-      <w:r>
-        <w:t xml:space="preserve">        html += "&lt;th&gt;Row&lt;/th&gt;" + "".join(f"&lt;th&gt;{col}&lt;/th&gt;" for col in df_display.columns) + "&lt;/tr&gt;&lt;/thead&gt;&lt;tbody&gt;"</w:t>
-      </w:r>
-    </w:p>
-    <w:p/>
-    <w:p>
-      <w:r>
-        <w:t xml:space="preserve">        for i in range(len(df_display)):</w:t>
-      </w:r>
-    </w:p>
-    <w:p>
-      <w:r>
-        <w:t xml:space="preserve">            row = df_display.iloc[i]</w:t>
-      </w:r>
-    </w:p>
-    <w:p>
-      <w:r>
-        <w:t xml:space="preserve">            row_class = ""</w:t>
-      </w:r>
-    </w:p>
-    <w:p/>
-    <w:p>
-      <w:r>
         <w:t xml:space="preserve">            if i &gt; 0 and "Piece ID" in df_display.columns:</w:t>
       </w:r>
     </w:p>
@@ -6434,64 +6474,64 @@
     <w:p/>
     <w:p>
       <w:r>
+        <w:t xml:space="preserve">                if col.lower() == "status":</w:t>
+      </w:r>
+    </w:p>
+    <w:p>
+      <w:r>
+        <w:t xml:space="preserve">                    cell_class = "pass" if str(val).lower() == "pass" else "fail"</w:t>
+      </w:r>
+    </w:p>
+    <w:p/>
+    <w:p>
+      <w:r>
+        <w:t xml:space="preserve">                if col == "Value": cell_class += " value-cell"</w:t>
+      </w:r>
+    </w:p>
+    <w:p>
+      <w:r>
+        <w:t xml:space="preserve">                elif col == "LSL": cell_class += " lsl-cell"</w:t>
+      </w:r>
+    </w:p>
+    <w:p>
+      <w:r>
+        <w:t xml:space="preserve">                elif col == "USL": cell_class += " usl-cell"</w:t>
+      </w:r>
+    </w:p>
+    <w:p/>
+    <w:p>
+      <w:r>
+        <w:t xml:space="preserve">                if col == "Image Path" and val != "":</w:t>
+      </w:r>
+    </w:p>
+    <w:p>
+      <w:r>
+        <w:t xml:space="preserve">                    img_path = val.strip()</w:t>
+      </w:r>
+    </w:p>
+    <w:p>
+      <w:r>
+        <w:t xml:space="preserve">                    if os.path.exists(img_path):</w:t>
+      </w:r>
+    </w:p>
+    <w:p>
+      <w:r>
+        <w:t xml:space="preserve">                        with open(img_path, "rb") as f:</w:t>
+      </w:r>
+    </w:p>
+    <w:p>
+      <w:r>
+        <w:t xml:space="preserve">                            data = f.read()</w:t>
+      </w:r>
+    </w:p>
+    <w:p>
+      <w:r>
+        <w:t xml:space="preserve">                            encoded = base64.b64encode(data).decode()</w:t>
+      </w:r>
+    </w:p>
+    <w:p>
+      <w:r>
         <w:lastRenderedPageBreak/>
-        <w:t xml:space="preserve">                if col.lower() == "status":</w:t>
-      </w:r>
-    </w:p>
-    <w:p>
-      <w:r>
-        <w:t xml:space="preserve">                    cell_class = "pass" if str(val).lower() == "pass" else "fail"</w:t>
-      </w:r>
-    </w:p>
-    <w:p/>
-    <w:p>
-      <w:r>
-        <w:t xml:space="preserve">                if col == "Value": cell_class += " value-cell"</w:t>
-      </w:r>
-    </w:p>
-    <w:p>
-      <w:r>
-        <w:t xml:space="preserve">                elif col == "LSL": cell_class += " lsl-cell"</w:t>
-      </w:r>
-    </w:p>
-    <w:p>
-      <w:r>
-        <w:t xml:space="preserve">                elif col == "USL": cell_class += " usl-cell"</w:t>
-      </w:r>
-    </w:p>
-    <w:p/>
-    <w:p>
-      <w:r>
-        <w:t xml:space="preserve">                if col == "Image Path" and val != "":</w:t>
-      </w:r>
-    </w:p>
-    <w:p>
-      <w:r>
-        <w:t xml:space="preserve">                    img_path = val.strip()</w:t>
-      </w:r>
-    </w:p>
-    <w:p>
-      <w:r>
-        <w:t xml:space="preserve">                    if os.path.exists(img_path):</w:t>
-      </w:r>
-    </w:p>
-    <w:p>
-      <w:r>
-        <w:t xml:space="preserve">                        with open(img_path, "rb") as f:</w:t>
-      </w:r>
-    </w:p>
-    <w:p>
-      <w:r>
-        <w:t xml:space="preserve">                            data = f.read()</w:t>
-      </w:r>
-    </w:p>
-    <w:p>
-      <w:r>
-        <w:t xml:space="preserve">                            encoded = base64.b64encode(data).decode()</w:t>
-      </w:r>
-    </w:p>
-    <w:p>
-      <w:r>
         <w:t xml:space="preserve">                        html += f"&lt;td class='{cell_class}'&gt;&lt;img src='data:image/jpeg;base64,{encoded}' class='image-cell'/&gt;&lt;/td&gt;"</w:t>
       </w:r>
     </w:p>
@@ -6540,7 +6580,6 @@
     </w:p>
     <w:p>
       <w:r>
-        <w:lastRenderedPageBreak/>
         <w:t xml:space="preserve">    st.markdown("### </w:t>
       </w:r>
       <w:r>
@@ -6606,6 +6645,7 @@
     </w:p>
     <w:p>
       <w:r>
+        <w:lastRenderedPageBreak/>
         <w:t xml:space="preserve">                parts = [r.strip() for r in raw.split(",") if r.strip()]</w:t>
       </w:r>
     </w:p>
@@ -6658,7 +6698,6 @@
     <w:p/>
     <w:p>
       <w:r>
-        <w:lastRenderedPageBreak/>
         <w:t xml:space="preserve">                if not rows_to_delete_orig:</w:t>
       </w:r>
     </w:p>
@@ -6747,6 +6786,7 @@
     </w:p>
     <w:p>
       <w:r>
+        <w:lastRenderedPageBreak/>
         <w:t xml:space="preserve">                        import time</w:t>
       </w:r>
     </w:p>
@@ -6826,7 +6866,6 @@
     </w:p>
     <w:p>
       <w:r>
-        <w:lastRenderedPageBreak/>
         <w:t xml:space="preserve">    st.markdown("### </w:t>
       </w:r>
       <w:r>
@@ -6892,6 +6931,7 @@
     </w:p>
     <w:p>
       <w:r>
+        <w:lastRenderedPageBreak/>
         <w:t xml:space="preserve">                for p in parts:</w:t>
       </w:r>
     </w:p>
@@ -6953,7 +6993,6 @@
     </w:p>
     <w:p>
       <w:r>
-        <w:lastRenderedPageBreak/>
         <w:t xml:space="preserve">                else:</w:t>
       </w:r>
     </w:p>
@@ -7024,6 +7063,7 @@
     </w:p>
     <w:p>
       <w:r>
+        <w:lastRenderedPageBreak/>
         <w:t xml:space="preserve">                        with pd.ExcelWriter(EXCEL, mode="a", engine="openpyxl", if_sheet_exists="replace") as writer:</w:t>
       </w:r>
     </w:p>
@@ -7125,7 +7165,6 @@
     <w:p/>
     <w:p>
       <w:r>
-        <w:lastRenderedPageBreak/>
         <w:t xml:space="preserve">    # ===================== EDIT MEASUREMENT DATA =====================</w:t>
       </w:r>
     </w:p>
@@ -7200,6 +7239,7 @@
     </w:p>
     <w:p>
       <w:r>
+        <w:lastRenderedPageBreak/>
         <w:t xml:space="preserve">        )</w:t>
       </w:r>
     </w:p>
@@ -7252,72 +7292,72 @@
     <w:p/>
     <w:p>
       <w:r>
+        <w:t xml:space="preserve">        with st.form("form_edit_row_excel_like"):</w:t>
+      </w:r>
+    </w:p>
+    <w:p>
+      <w:r>
+        <w:t xml:space="preserve">            new_entries = {}</w:t>
+      </w:r>
+    </w:p>
+    <w:p>
+      <w:r>
+        <w:t xml:space="preserve">            for col in editable_cols:</w:t>
+      </w:r>
+    </w:p>
+    <w:p>
+      <w:r>
+        <w:t xml:space="preserve">                val = selected_row[col]</w:t>
+      </w:r>
+    </w:p>
+    <w:p>
+      <w:r>
+        <w:t xml:space="preserve">                if col == "Measured Date":</w:t>
+      </w:r>
+    </w:p>
+    <w:p>
+      <w:r>
+        <w:t xml:space="preserve">                    try:</w:t>
+      </w:r>
+    </w:p>
+    <w:p>
+      <w:r>
+        <w:t xml:space="preserve">                        date_val = pd.to_datetime(val).date() if pd.notna(val) else datetime.now().date()</w:t>
+      </w:r>
+    </w:p>
+    <w:p>
+      <w:r>
+        <w:t xml:space="preserve">                    except:</w:t>
+      </w:r>
+    </w:p>
+    <w:p>
+      <w:r>
+        <w:t xml:space="preserve">                        date_val = datetime.now().date()</w:t>
+      </w:r>
+    </w:p>
+    <w:p>
+      <w:r>
+        <w:t xml:space="preserve">                    new_entries[col] = st.date_input("Measured Date", value=date_val, key=f"edit_{col}")</w:t>
+      </w:r>
+    </w:p>
+    <w:p>
+      <w:r>
+        <w:t xml:space="preserve">                    </w:t>
+      </w:r>
+    </w:p>
+    <w:p>
+      <w:r>
+        <w:t xml:space="preserve">                elif col == "Batch Cleaning":</w:t>
+      </w:r>
+    </w:p>
+    <w:p>
+      <w:r>
+        <w:t xml:space="preserve">                    # Ensure value is float to match min_value and step type</w:t>
+      </w:r>
+    </w:p>
+    <w:p>
+      <w:r>
         <w:lastRenderedPageBreak/>
-        <w:t xml:space="preserve">        with st.form("form_edit_row_excel_like"):</w:t>
-      </w:r>
-    </w:p>
-    <w:p>
-      <w:r>
-        <w:t xml:space="preserve">            new_entries = {}</w:t>
-      </w:r>
-    </w:p>
-    <w:p>
-      <w:r>
-        <w:t xml:space="preserve">            for col in editable_cols:</w:t>
-      </w:r>
-    </w:p>
-    <w:p>
-      <w:r>
-        <w:t xml:space="preserve">                val = selected_row[col]</w:t>
-      </w:r>
-    </w:p>
-    <w:p>
-      <w:r>
-        <w:t xml:space="preserve">                if col == "Measured Date":</w:t>
-      </w:r>
-    </w:p>
-    <w:p>
-      <w:r>
-        <w:t xml:space="preserve">                    try:</w:t>
-      </w:r>
-    </w:p>
-    <w:p>
-      <w:r>
-        <w:t xml:space="preserve">                        date_val = pd.to_datetime(val).date() if pd.notna(val) else datetime.now().date()</w:t>
-      </w:r>
-    </w:p>
-    <w:p>
-      <w:r>
-        <w:t xml:space="preserve">                    except:</w:t>
-      </w:r>
-    </w:p>
-    <w:p>
-      <w:r>
-        <w:t xml:space="preserve">                        date_val = datetime.now().date()</w:t>
-      </w:r>
-    </w:p>
-    <w:p>
-      <w:r>
-        <w:t xml:space="preserve">                    new_entries[col] = st.date_input("Measured Date", value=date_val, key=f"edit_{col}")</w:t>
-      </w:r>
-    </w:p>
-    <w:p>
-      <w:r>
-        <w:t xml:space="preserve">                    </w:t>
-      </w:r>
-    </w:p>
-    <w:p>
-      <w:r>
-        <w:t xml:space="preserve">                elif col == "Batch Cleaning":</w:t>
-      </w:r>
-    </w:p>
-    <w:p>
-      <w:r>
-        <w:t xml:space="preserve">                    # Ensure value is float to match min_value and step type</w:t>
-      </w:r>
-    </w:p>
-    <w:p>
-      <w:r>
         <w:t xml:space="preserve">                    batch_val = 0.0 if val in [None, ""] else float(val)</w:t>
       </w:r>
     </w:p>
@@ -7374,59 +7414,59 @@
     </w:p>
     <w:p>
       <w:r>
+        <w:t xml:space="preserve">                    new_entries[col] = st.text_input(col, value="" if pd.isna(val) else str(val), key=f"edit_{col}")</w:t>
+      </w:r>
+    </w:p>
+    <w:p/>
+    <w:p>
+      <w:r>
+        <w:t xml:space="preserve">            part_inout_val = selected_row.get("Part In/Out", "IN")</w:t>
+      </w:r>
+    </w:p>
+    <w:p>
+      <w:r>
+        <w:t xml:space="preserve">            edit_part_inout = st.selectbox("Part In/Out", options=["IN", "OUT"], index=0 if str(part_inout_val).upper() == "IN" else 1)</w:t>
+      </w:r>
+    </w:p>
+    <w:p/>
+    <w:p>
+      <w:r>
+        <w:t xml:space="preserve">            hole_type = selected_row.get('Hole', 'N/A')</w:t>
+      </w:r>
+    </w:p>
+    <w:p>
+      <w:r>
+        <w:t xml:space="preserve">            hole_image = st.file_uploader(f"Upload Image for Hole {hole_type}", type=["png", "jpg", "jpeg"], key=f"hole_{hole_type}")</w:t>
+      </w:r>
+    </w:p>
+    <w:p>
+      <w:r>
+        <w:t xml:space="preserve">            if hole_image:</w:t>
+      </w:r>
+    </w:p>
+    <w:p>
+      <w:r>
+        <w:t xml:space="preserve">                feature_type = selected_row.get("Feature", "Unknown")</w:t>
+      </w:r>
+    </w:p>
+    <w:p>
+      <w:r>
+        <w:t xml:space="preserve">                image_filename = f"{selected_row['Hole']}_{feature_type}.jpg"</w:t>
+      </w:r>
+    </w:p>
+    <w:p>
+      <w:r>
+        <w:t xml:space="preserve">                image_path = os.path.join("uploaded_images", image_filename)</w:t>
+      </w:r>
+    </w:p>
+    <w:p>
+      <w:r>
+        <w:t xml:space="preserve">                with open(image_path, "wb") as img_file:</w:t>
+      </w:r>
+    </w:p>
+    <w:p>
+      <w:r>
         <w:lastRenderedPageBreak/>
-        <w:t xml:space="preserve">                    new_entries[col] = st.text_input(col, value="" if pd.isna(val) else str(val), key=f"edit_{col}")</w:t>
-      </w:r>
-    </w:p>
-    <w:p/>
-    <w:p>
-      <w:r>
-        <w:t xml:space="preserve">            part_inout_val = selected_row.get("Part In/Out", "IN")</w:t>
-      </w:r>
-    </w:p>
-    <w:p>
-      <w:r>
-        <w:t xml:space="preserve">            edit_part_inout = st.selectbox("Part In/Out", options=["IN", "OUT"], index=0 if str(part_inout_val).upper() == "IN" else 1)</w:t>
-      </w:r>
-    </w:p>
-    <w:p/>
-    <w:p>
-      <w:r>
-        <w:t xml:space="preserve">            hole_type = selected_row.get('Hole', 'N/A')</w:t>
-      </w:r>
-    </w:p>
-    <w:p>
-      <w:r>
-        <w:t xml:space="preserve">            hole_image = st.file_uploader(f"Upload Image for Hole {hole_type}", type=["png", "jpg", "jpeg"], key=f"hole_{hole_type}")</w:t>
-      </w:r>
-    </w:p>
-    <w:p>
-      <w:r>
-        <w:t xml:space="preserve">            if hole_image:</w:t>
-      </w:r>
-    </w:p>
-    <w:p>
-      <w:r>
-        <w:t xml:space="preserve">                feature_type = selected_row.get("Feature", "Unknown")</w:t>
-      </w:r>
-    </w:p>
-    <w:p>
-      <w:r>
-        <w:t xml:space="preserve">                image_filename = f"{selected_row['Hole']}_{feature_type}.jpg"</w:t>
-      </w:r>
-    </w:p>
-    <w:p>
-      <w:r>
-        <w:t xml:space="preserve">                image_path = os.path.join("uploaded_images", image_filename)</w:t>
-      </w:r>
-    </w:p>
-    <w:p>
-      <w:r>
-        <w:t xml:space="preserve">                with open(image_path, "wb") as img_file:</w:t>
-      </w:r>
-    </w:p>
-    <w:p>
-      <w:r>
         <w:t xml:space="preserve">                    img_file.write(hole_image.getbuffer())</w:t>
       </w:r>
     </w:p>
@@ -7483,58 +7523,110 @@
     </w:p>
     <w:p>
       <w:r>
+        <w:t xml:space="preserve">            df_upd = df_view_orig.copy()</w:t>
+      </w:r>
+    </w:p>
+    <w:p>
+      <w:r>
+        <w:t xml:space="preserve">            for col, val in new_entries.items():</w:t>
+      </w:r>
+    </w:p>
+    <w:p>
+      <w:r>
+        <w:t xml:space="preserve">                if col == "Measured Date":</w:t>
+      </w:r>
+    </w:p>
+    <w:p>
+      <w:r>
+        <w:t xml:space="preserve">                    df_upd.at[orig_idx, col] = val.strftime("%Y-%m-%d")</w:t>
+      </w:r>
+    </w:p>
+    <w:p>
+      <w:r>
+        <w:t xml:space="preserve">                elif col == "Batch Cleaning":</w:t>
+      </w:r>
+    </w:p>
+    <w:p>
+      <w:r>
+        <w:t xml:space="preserve">                    df_upd.at[orig_idx, col] = val if val != 0 else ""</w:t>
+      </w:r>
+    </w:p>
+    <w:p>
+      <w:r>
+        <w:t xml:space="preserve">                elif col == "Value":</w:t>
+      </w:r>
+    </w:p>
+    <w:p>
+      <w:r>
+        <w:t xml:space="preserve">                    try:</w:t>
+      </w:r>
+    </w:p>
+    <w:p>
+      <w:r>
+        <w:t xml:space="preserve">                        df_upd.at[orig_idx, col] = float(val)</w:t>
+      </w:r>
+    </w:p>
+    <w:p>
+      <w:r>
+        <w:t xml:space="preserve">                    except:</w:t>
+      </w:r>
+    </w:p>
+    <w:p>
+      <w:r>
+        <w:t xml:space="preserve">                        df_upd.at[orig_idx, col] = val</w:t>
+      </w:r>
+    </w:p>
+    <w:p>
+      <w:r>
+        <w:t xml:space="preserve">                else:</w:t>
+      </w:r>
+    </w:p>
+    <w:p>
+      <w:r>
+        <w:t xml:space="preserve">                    df_upd.at[orig_idx, col] = val</w:t>
+      </w:r>
+    </w:p>
+    <w:p/>
+    <w:p>
+      <w:r>
         <w:lastRenderedPageBreak/>
-        <w:t xml:space="preserve">            df_upd = df_view_orig.copy()</w:t>
-      </w:r>
-    </w:p>
-    <w:p>
-      <w:r>
-        <w:t xml:space="preserve">            for col, val in new_entries.items():</w:t>
-      </w:r>
-    </w:p>
-    <w:p>
-      <w:r>
-        <w:t xml:space="preserve">                if col == "Measured Date":</w:t>
-      </w:r>
-    </w:p>
-    <w:p>
-      <w:r>
-        <w:t xml:space="preserve">                    df_upd.at[orig_idx, col] = val.strftime("%Y-%m-%d")</w:t>
-      </w:r>
-    </w:p>
-    <w:p>
-      <w:r>
-        <w:t xml:space="preserve">                elif col == "Batch Cleaning":</w:t>
-      </w:r>
-    </w:p>
-    <w:p>
-      <w:r>
-        <w:t xml:space="preserve">                    df_upd.at[orig_idx, col] = val if val != 0 else ""</w:t>
-      </w:r>
-    </w:p>
-    <w:p>
-      <w:r>
-        <w:t xml:space="preserve">                elif col == "Value":</w:t>
-      </w:r>
-    </w:p>
-    <w:p>
-      <w:r>
-        <w:t xml:space="preserve">                    try:</w:t>
-      </w:r>
-    </w:p>
-    <w:p>
-      <w:r>
-        <w:t xml:space="preserve">                        df_upd.at[orig_idx, col] = float(val)</w:t>
-      </w:r>
-    </w:p>
-    <w:p>
-      <w:r>
-        <w:t xml:space="preserve">                    except:</w:t>
-      </w:r>
-    </w:p>
-    <w:p>
-      <w:r>
-        <w:t xml:space="preserve">                        df_upd.at[orig_idx, col] = val</w:t>
+        <w:t xml:space="preserve">            df_upd.at[orig_idx, "Part In/Out"] = edit_part_inout</w:t>
+      </w:r>
+    </w:p>
+    <w:p/>
+    <w:p>
+      <w:r>
+        <w:t xml:space="preserve">            # Recalculate Status</w:t>
+      </w:r>
+    </w:p>
+    <w:p>
+      <w:r>
+        <w:t xml:space="preserve">            try:</w:t>
+      </w:r>
+    </w:p>
+    <w:p>
+      <w:r>
+        <w:t xml:space="preserve">                val = df_upd.at[orig_idx, "Value"]</w:t>
+      </w:r>
+    </w:p>
+    <w:p>
+      <w:r>
+        <w:t xml:space="preserve">                lsl = df_upd.at[orig_idx, "LSL"]</w:t>
+      </w:r>
+    </w:p>
+    <w:p>
+      <w:r>
+        <w:t xml:space="preserve">                usl = df_upd.at[orig_idx, "USL"]</w:t>
+      </w:r>
+    </w:p>
+    <w:p>
+      <w:r>
+        <w:t xml:space="preserve">                if pd.notna(val) and pd.notna(lsl) and pd.notna(usl):</w:t>
+      </w:r>
+    </w:p>
+    <w:p>
+      <w:r>
+        <w:t xml:space="preserve">                    df_upd.at[orig_idx, "Status"] = "Fail" if val &lt; lsl or val &gt; usl else "Pass"</w:t>
       </w:r>
     </w:p>
     <w:p>
@@ -7544,58 +7636,6 @@
     </w:p>
     <w:p>
       <w:r>
-        <w:t xml:space="preserve">                    df_upd.at[orig_idx, col] = val</w:t>
-      </w:r>
-    </w:p>
-    <w:p/>
-    <w:p>
-      <w:r>
-        <w:t xml:space="preserve">            df_upd.at[orig_idx, "Part In/Out"] = edit_part_inout</w:t>
-      </w:r>
-    </w:p>
-    <w:p/>
-    <w:p>
-      <w:r>
-        <w:t xml:space="preserve">            # Recalculate Status</w:t>
-      </w:r>
-    </w:p>
-    <w:p>
-      <w:r>
-        <w:t xml:space="preserve">            try:</w:t>
-      </w:r>
-    </w:p>
-    <w:p>
-      <w:r>
-        <w:t xml:space="preserve">                val = df_upd.at[orig_idx, "Value"]</w:t>
-      </w:r>
-    </w:p>
-    <w:p>
-      <w:r>
-        <w:t xml:space="preserve">                lsl = df_upd.at[orig_idx, "LSL"]</w:t>
-      </w:r>
-    </w:p>
-    <w:p>
-      <w:r>
-        <w:t xml:space="preserve">                usl = df_upd.at[orig_idx, "USL"]</w:t>
-      </w:r>
-    </w:p>
-    <w:p>
-      <w:r>
-        <w:t xml:space="preserve">                if pd.notna(val) and pd.notna(lsl) and pd.notna(usl):</w:t>
-      </w:r>
-    </w:p>
-    <w:p>
-      <w:r>
-        <w:t xml:space="preserve">                    df_upd.at[orig_idx, "Status"] = "Fail" if val &lt; lsl or val &gt; usl else "Pass"</w:t>
-      </w:r>
-    </w:p>
-    <w:p>
-      <w:r>
-        <w:t xml:space="preserve">                else:</w:t>
-      </w:r>
-    </w:p>
-    <w:p>
-      <w:r>
         <w:t xml:space="preserve">                    df_upd.at[orig_idx, "Status"] = "N/A"</w:t>
       </w:r>
     </w:p>
@@ -7606,7 +7646,6 @@
     </w:p>
     <w:p>
       <w:r>
-        <w:lastRenderedPageBreak/>
         <w:t xml:space="preserve">                df_upd.at[orig_idx, "Status"] = "N/A"</w:t>
       </w:r>
     </w:p>
@@ -7700,6 +7739,7 @@
     <w:p/>
     <w:p>
       <w:r>
+        <w:lastRenderedPageBreak/>
         <w:t xml:space="preserve">                    </w:t>
       </w:r>
     </w:p>
@@ -7765,7 +7805,6 @@
     </w:p>
     <w:p>
       <w:r>
-        <w:lastRenderedPageBreak/>
         <w:t xml:space="preserve">        text-align:center;</w:t>
       </w:r>
     </w:p>
@@ -7836,6 +7875,7 @@
     </w:p>
     <w:p>
       <w:r>
+        <w:lastRenderedPageBreak/>
         <w:t xml:space="preserve">      100% { opacity: 0; display: none; }</w:t>
       </w:r>
     </w:p>
@@ -7945,6 +7985,7 @@
     </w:p>
     <w:p>
       <w:r>
+        <w:lastRenderedPageBreak/>
         <w:t xml:space="preserve">                    filename=filename_input,</w:t>
       </w:r>
     </w:p>
@@ -8004,7 +8045,6 @@
     </w:p>
     <w:p>
       <w:r>
-        <w:lastRenderedPageBreak/>
         <w:t xml:space="preserve">                else:</w:t>
       </w:r>
     </w:p>
@@ -8045,6 +8085,20 @@
         <w:t xml:space="preserve">    st.subheader("Excel Files")</w:t>
       </w:r>
     </w:p>
+    <w:p>
+      <w:r>
+        <w:t xml:space="preserve">    st.info("</w:t>
+      </w:r>
+      <w:r>
+        <w:rPr>
+          <w:rFonts w:ascii="Segoe UI Emoji" w:hAnsi="Segoe UI Emoji" w:cs="Segoe UI Emoji"/>
+        </w:rPr>
+        <w:t>💡</w:t>
+      </w:r>
+      <w:r>
+        <w:t xml:space="preserve"> It is strongly recommended to download a copy of the Excel file regularly to prevent any unexpected data loss.")</w:t>
+      </w:r>
+    </w:p>
     <w:p/>
     <w:p>
       <w:r>
@@ -8102,7 +8156,6 @@
     <w:p/>
     <w:p>
       <w:r>
-        <w:lastRenderedPageBreak/>
         <w:t xml:space="preserve">    with col_open:</w:t>
       </w:r>
     </w:p>
@@ -8178,6 +8231,7 @@
     </w:p>
     <w:p>
       <w:r>
+        <w:lastRenderedPageBreak/>
         <w:t xml:space="preserve">                with open(selected_file_path, "rb") as fh:</w:t>
       </w:r>
     </w:p>
@@ -8243,7 +8297,6 @@
     <w:p/>
     <w:p>
       <w:r>
-        <w:lastRenderedPageBreak/>
         <w:t># Footer</w:t>
       </w:r>
     </w:p>
@@ -8314,6 +8367,7 @@
     </w:p>
     <w:p>
       <w:r>
+        <w:lastRenderedPageBreak/>
         <w:t>"""</w:t>
       </w:r>
     </w:p>
@@ -8432,6 +8486,7 @@
     </w:p>
     <w:p>
       <w:r>
+        <w:lastRenderedPageBreak/>
         <w:t xml:space="preserve">    def classify_hole(hole_name):</w:t>
       </w:r>
     </w:p>
@@ -8560,6 +8615,7 @@
     </w:p>
     <w:p>
       <w:r>
+        <w:lastRenderedPageBreak/>
         <w:t xml:space="preserve">                    df["Hole Type"] = df["Hole"].apply(classify_hole)</w:t>
       </w:r>
     </w:p>
@@ -8612,7 +8668,6 @@
     </w:p>
     <w:p>
       <w:r>
-        <w:lastRenderedPageBreak/>
         <w:t xml:space="preserve">                col1.metric("</w:t>
       </w:r>
       <w:r>
@@ -8759,7 +8814,6 @@
     <w:p/>
     <w:p>
       <w:r>
-        <w:lastRenderedPageBreak/>
         <w:t xml:space="preserve">                # ------------------ GAS WATER BLOCK ------------------</w:t>
       </w:r>
     </w:p>
@@ -8896,7 +8950,6 @@
     </w:p>
     <w:p>
       <w:r>
-        <w:lastRenderedPageBreak/>
         <w:t xml:space="preserve">                    name="Out of Spec", marker_color="#d62728"</w:t>
       </w:r>
     </w:p>
@@ -8977,6 +9030,7 @@
     </w:p>
     <w:p>
       <w:r>
+        <w:lastRenderedPageBreak/>
         <w:t xml:space="preserve">                    yaxis=dict(</w:t>
       </w:r>
     </w:p>
@@ -9032,183 +9086,183 @@
     </w:p>
     <w:p>
       <w:r>
+        <w:t xml:space="preserve">                st.plotly_chart(fig, use_container_width=True)</w:t>
+      </w:r>
+    </w:p>
+    <w:p/>
+    <w:p>
+      <w:r>
+        <w:t xml:space="preserve">                # ------------------ CREATE PROFESSIONAL EXCEL ------------------</w:t>
+      </w:r>
+    </w:p>
+    <w:p>
+      <w:r>
+        <w:t xml:space="preserve">                def write_sheet(ws, df, title):</w:t>
+      </w:r>
+    </w:p>
+    <w:p>
+      <w:r>
+        <w:t xml:space="preserve">                    # Add Index column starting from 1</w:t>
+      </w:r>
+    </w:p>
+    <w:p>
+      <w:r>
+        <w:t xml:space="preserve">                    df_insert = df.copy()</w:t>
+      </w:r>
+    </w:p>
+    <w:p>
+      <w:r>
+        <w:t xml:space="preserve">                    df_insert.insert(0, "Index", np.arange(1, len(df_insert)+1))</w:t>
+      </w:r>
+    </w:p>
+    <w:p/>
+    <w:p>
+      <w:r>
+        <w:t xml:space="preserve">                    # Merge top row for title</w:t>
+      </w:r>
+    </w:p>
+    <w:p>
+      <w:r>
+        <w:t xml:space="preserve">                    ws.merge_cells(start_row=1, start_column=1, end_row=1, end_column=len(df_insert.columns))</w:t>
+      </w:r>
+    </w:p>
+    <w:p>
+      <w:r>
+        <w:t xml:space="preserve">                    cell = ws.cell(row=1, column=1, value=title)</w:t>
+      </w:r>
+    </w:p>
+    <w:p>
+      <w:r>
+        <w:t xml:space="preserve">                    cell.font = Font(size=14, bold=True, color="003366")</w:t>
+      </w:r>
+    </w:p>
+    <w:p>
+      <w:r>
+        <w:t xml:space="preserve">                    cell.alignment = Alignment(horizontal="center", vertical="center")</w:t>
+      </w:r>
+    </w:p>
+    <w:p>
+      <w:r>
+        <w:t xml:space="preserve">                    cell.fill = PatternFill(start_color="cce6ff", fill_type="solid")</w:t>
+      </w:r>
+    </w:p>
+    <w:p/>
+    <w:p>
+      <w:r>
+        <w:t xml:space="preserve">                    # Leave one blank row</w:t>
+      </w:r>
+    </w:p>
+    <w:p>
+      <w:r>
+        <w:t xml:space="preserve">                    ws.append([])</w:t>
+      </w:r>
+    </w:p>
+    <w:p/>
+    <w:p>
+      <w:r>
+        <w:t xml:space="preserve">                    # Header styling</w:t>
+      </w:r>
+    </w:p>
+    <w:p>
+      <w:r>
+        <w:t xml:space="preserve">                    header_fill = PatternFill(start_color="ADD8E6", fill_type="solid")</w:t>
+      </w:r>
+    </w:p>
+    <w:p>
+      <w:r>
+        <w:t xml:space="preserve">                    header_font = Font(bold=True, color="003366")</w:t>
+      </w:r>
+    </w:p>
+    <w:p>
+      <w:r>
+        <w:t xml:space="preserve">                    thin_border = Border(left=Side(style='thin'),</w:t>
+      </w:r>
+    </w:p>
+    <w:p>
+      <w:r>
+        <w:t xml:space="preserve">                                         right=Side(style='thin'),</w:t>
+      </w:r>
+    </w:p>
+    <w:p>
+      <w:r>
+        <w:t xml:space="preserve">                                         top=Side(style='thin'),</w:t>
+      </w:r>
+    </w:p>
+    <w:p>
+      <w:r>
+        <w:t xml:space="preserve">                                         bottom=Side(style='thin'))</w:t>
+      </w:r>
+    </w:p>
+    <w:p/>
+    <w:p>
+      <w:r>
+        <w:t xml:space="preserve">                    for c, col in enumerate(df_insert.columns, 1):</w:t>
+      </w:r>
+    </w:p>
+    <w:p>
+      <w:r>
+        <w:t xml:space="preserve">                        cell = ws.cell(row=3, column=c, value=col)</w:t>
+      </w:r>
+    </w:p>
+    <w:p>
+      <w:r>
+        <w:t xml:space="preserve">                        cell.font = header_font</w:t>
+      </w:r>
+    </w:p>
+    <w:p>
+      <w:r>
+        <w:t xml:space="preserve">                        cell.fill = header_fill</w:t>
+      </w:r>
+    </w:p>
+    <w:p>
+      <w:r>
+        <w:t xml:space="preserve">                        cell.alignment = Alignment(horizontal="center")</w:t>
+      </w:r>
+    </w:p>
+    <w:p>
+      <w:r>
+        <w:t xml:space="preserve">                        cell.border = thin_border</w:t>
+      </w:r>
+    </w:p>
+    <w:p/>
+    <w:p>
+      <w:r>
+        <w:t xml:space="preserve">                    # Write data rows</w:t>
+      </w:r>
+    </w:p>
+    <w:p>
+      <w:r>
+        <w:t xml:space="preserve">                    for r, row in enumerate(df_insert.itertuples(index=False), 4):</w:t>
+      </w:r>
+    </w:p>
+    <w:p>
+      <w:r>
+        <w:t xml:space="preserve">                        for c, val in enumerate(row, 1):</w:t>
+      </w:r>
+    </w:p>
+    <w:p>
+      <w:r>
+        <w:t xml:space="preserve">                            cell = ws.cell(row=r, column=c, value=val)</w:t>
+      </w:r>
+    </w:p>
+    <w:p>
+      <w:r>
+        <w:t xml:space="preserve">                            cell.alignment = Alignment(horizontal="center")</w:t>
+      </w:r>
+    </w:p>
+    <w:p>
+      <w:r>
+        <w:t xml:space="preserve">                            cell.border = thin_border</w:t>
+      </w:r>
+    </w:p>
+    <w:p>
+      <w:r>
+        <w:t xml:space="preserve">                            if df_insert.columns[c-1] == "In Spec":</w:t>
+      </w:r>
+    </w:p>
+    <w:p>
+      <w:r>
         <w:lastRenderedPageBreak/>
-        <w:t xml:space="preserve">                st.plotly_chart(fig, use_container_width=True)</w:t>
-      </w:r>
-    </w:p>
-    <w:p/>
-    <w:p>
-      <w:r>
-        <w:t xml:space="preserve">                # ------------------ CREATE PROFESSIONAL EXCEL ------------------</w:t>
-      </w:r>
-    </w:p>
-    <w:p>
-      <w:r>
-        <w:t xml:space="preserve">                def write_sheet(ws, df, title):</w:t>
-      </w:r>
-    </w:p>
-    <w:p>
-      <w:r>
-        <w:t xml:space="preserve">                    # Add Index column starting from 1</w:t>
-      </w:r>
-    </w:p>
-    <w:p>
-      <w:r>
-        <w:t xml:space="preserve">                    df_insert = df.copy()</w:t>
-      </w:r>
-    </w:p>
-    <w:p>
-      <w:r>
-        <w:t xml:space="preserve">                    df_insert.insert(0, "Index", np.arange(1, len(df_insert)+1))</w:t>
-      </w:r>
-    </w:p>
-    <w:p/>
-    <w:p>
-      <w:r>
-        <w:t xml:space="preserve">                    # Merge top row for title</w:t>
-      </w:r>
-    </w:p>
-    <w:p>
-      <w:r>
-        <w:t xml:space="preserve">                    ws.merge_cells(start_row=1, start_column=1, end_row=1, end_column=len(df_insert.columns))</w:t>
-      </w:r>
-    </w:p>
-    <w:p>
-      <w:r>
-        <w:t xml:space="preserve">                    cell = ws.cell(row=1, column=1, value=title)</w:t>
-      </w:r>
-    </w:p>
-    <w:p>
-      <w:r>
-        <w:t xml:space="preserve">                    cell.font = Font(size=14, bold=True, color="003366")</w:t>
-      </w:r>
-    </w:p>
-    <w:p>
-      <w:r>
-        <w:t xml:space="preserve">                    cell.alignment = Alignment(horizontal="center", vertical="center")</w:t>
-      </w:r>
-    </w:p>
-    <w:p>
-      <w:r>
-        <w:t xml:space="preserve">                    cell.fill = PatternFill(start_color="cce6ff", fill_type="solid")</w:t>
-      </w:r>
-    </w:p>
-    <w:p/>
-    <w:p>
-      <w:r>
-        <w:t xml:space="preserve">                    # Leave one blank row</w:t>
-      </w:r>
-    </w:p>
-    <w:p>
-      <w:r>
-        <w:t xml:space="preserve">                    ws.append([])</w:t>
-      </w:r>
-    </w:p>
-    <w:p/>
-    <w:p>
-      <w:r>
-        <w:t xml:space="preserve">                    # Header styling</w:t>
-      </w:r>
-    </w:p>
-    <w:p>
-      <w:r>
-        <w:t xml:space="preserve">                    header_fill = PatternFill(start_color="ADD8E6", fill_type="solid")</w:t>
-      </w:r>
-    </w:p>
-    <w:p>
-      <w:r>
-        <w:t xml:space="preserve">                    header_font = Font(bold=True, color="003366")</w:t>
-      </w:r>
-    </w:p>
-    <w:p>
-      <w:r>
-        <w:t xml:space="preserve">                    thin_border = Border(left=Side(style='thin'),</w:t>
-      </w:r>
-    </w:p>
-    <w:p>
-      <w:r>
-        <w:t xml:space="preserve">                                         right=Side(style='thin'),</w:t>
-      </w:r>
-    </w:p>
-    <w:p>
-      <w:r>
-        <w:t xml:space="preserve">                                         top=Side(style='thin'),</w:t>
-      </w:r>
-    </w:p>
-    <w:p>
-      <w:r>
-        <w:t xml:space="preserve">                                         bottom=Side(style='thin'))</w:t>
-      </w:r>
-    </w:p>
-    <w:p/>
-    <w:p>
-      <w:r>
-        <w:t xml:space="preserve">                    for c, col in enumerate(df_insert.columns, 1):</w:t>
-      </w:r>
-    </w:p>
-    <w:p>
-      <w:r>
-        <w:t xml:space="preserve">                        cell = ws.cell(row=3, column=c, value=col)</w:t>
-      </w:r>
-    </w:p>
-    <w:p>
-      <w:r>
-        <w:t xml:space="preserve">                        cell.font = header_font</w:t>
-      </w:r>
-    </w:p>
-    <w:p>
-      <w:r>
-        <w:t xml:space="preserve">                        cell.fill = header_fill</w:t>
-      </w:r>
-    </w:p>
-    <w:p>
-      <w:r>
-        <w:t xml:space="preserve">                        cell.alignment = Alignment(horizontal="center")</w:t>
-      </w:r>
-    </w:p>
-    <w:p>
-      <w:r>
-        <w:t xml:space="preserve">                        cell.border = thin_border</w:t>
-      </w:r>
-    </w:p>
-    <w:p/>
-    <w:p>
-      <w:r>
-        <w:t xml:space="preserve">                    # Write data rows</w:t>
-      </w:r>
-    </w:p>
-    <w:p>
-      <w:r>
-        <w:t xml:space="preserve">                    for r, row in enumerate(df_insert.itertuples(index=False), 4):</w:t>
-      </w:r>
-    </w:p>
-    <w:p>
-      <w:r>
-        <w:t xml:space="preserve">                        for c, val in enumerate(row, 1):</w:t>
-      </w:r>
-    </w:p>
-    <w:p>
-      <w:r>
-        <w:t xml:space="preserve">                            cell = ws.cell(row=r, column=c, value=val)</w:t>
-      </w:r>
-    </w:p>
-    <w:p>
-      <w:r>
-        <w:t xml:space="preserve">                            cell.alignment = Alignment(horizontal="center")</w:t>
-      </w:r>
-    </w:p>
-    <w:p>
-      <w:r>
-        <w:t xml:space="preserve">                            cell.border = thin_border</w:t>
-      </w:r>
-    </w:p>
-    <w:p>
-      <w:r>
-        <w:t xml:space="preserve">                            if df_insert.columns[c-1] == "In Spec":</w:t>
-      </w:r>
-    </w:p>
-    <w:p>
-      <w:r>
         <w:t xml:space="preserve">                                if val == "No":</w:t>
       </w:r>
     </w:p>
@@ -9252,7 +9306,6 @@
     </w:p>
     <w:p>
       <w:r>
-        <w:lastRenderedPageBreak/>
         <w:t xml:space="preserve">                write_sheet(ws1, df_mb_show, "Mixing Block - All Measurements")</w:t>
       </w:r>
     </w:p>
@@ -9317,6 +9370,7 @@
     </w:p>
     <w:p>
       <w:r>
+        <w:lastRenderedPageBreak/>
         <w:t xml:space="preserve">                st.download_button(</w:t>
       </w:r>
     </w:p>

</xml_diff>